<commit_message>
Add/update hin data for UWTranslationNotes
</commit_message>
<xml_diff>
--- a/hin/docx/08.content.docx
+++ b/hin/docx/08.content.docx
@@ -1646,6 +1646,132 @@
         <w:rPr>
           <w:lang w:val="hi_IN" w:bidi="hi_IN"/>
         </w:rPr>
+        <w:t>रूत 1:4 (#2)</w:t>
+      </w:r>
+      <w:r>
+        <w:rPr>
+          <w:lang w:val="hi_IN" w:bidi="hi_IN"/>
+        </w:rPr>
+      </w:r>
+    </w:p>
+    <w:p>
+      <w:pPr/>
+      <w:r>
+        <w:rPr>
+          <w:lang w:val="hi_IN" w:bidi="hi_IN"/>
+        </w:rPr>
+      </w:r>
+      <w:r>
+        <w:rPr>
+          <w:b/>
+          <w:lang w:val="hi_IN" w:bidi="hi_IN"/>
+        </w:rPr>
+        <w:t>"मोआबिन"</w:t>
+      </w:r>
+    </w:p>
+    <w:p>
+      <w:pPr/>
+      <w:r>
+        <w:rPr>
+          <w:lang w:val="hi_IN" w:bidi="hi_IN"/>
+        </w:rPr>
+      </w:r>
+      <w:r>
+        <w:rPr>
+          <w:lang w:val="hi_IN" w:bidi="hi_IN"/>
+        </w:rPr>
+        <w:t>नाओमी के पुत्रों ने उन महिलाओं से शादी की जो मोआब के गोत्र से थी। मोआबियों ने अन्य देवताओं की पूजा की।</w:t>
+      </w:r>
+      <w:r>
+        <w:rPr>
+          <w:lang w:val="hi_IN" w:bidi="hi_IN"/>
+        </w:rPr>
+      </w:r>
+      <w:r>
+        <w:rPr>
+          <w:lang w:val="hi_IN" w:bidi="hi_IN"/>
+        </w:rPr>
+      </w:r>
+    </w:p>
+    <w:p>
+      <w:pPr/>
+      <w:r>
+        <w:rPr>
+          <w:lang w:val="hi_IN" w:bidi="hi_IN"/>
+        </w:rPr>
+      </w:r>
+    </w:p>
+    <w:p>
+      <w:pPr>
+        <w:pStyle w:val="Heading2"/>
+      </w:pPr>
+      <w:r>
+        <w:rPr>
+          <w:lang w:val="hi_IN" w:bidi="hi_IN"/>
+        </w:rPr>
+        <w:t>रूत 1:4 (#4)</w:t>
+      </w:r>
+      <w:r>
+        <w:rPr>
+          <w:lang w:val="hi_IN" w:bidi="hi_IN"/>
+        </w:rPr>
+      </w:r>
+    </w:p>
+    <w:p>
+      <w:pPr/>
+      <w:r>
+        <w:rPr>
+          <w:lang w:val="hi_IN" w:bidi="hi_IN"/>
+        </w:rPr>
+      </w:r>
+      <w:r>
+        <w:rPr>
+          <w:b/>
+          <w:lang w:val="hi_IN" w:bidi="hi_IN"/>
+        </w:rPr>
+        <w:t>"दस वर्ष"</w:t>
+      </w:r>
+    </w:p>
+    <w:p>
+      <w:pPr/>
+      <w:r>
+        <w:rPr>
+          <w:lang w:val="hi_IN" w:bidi="hi_IN"/>
+        </w:rPr>
+      </w:r>
+      <w:r>
+        <w:rPr>
+          <w:lang w:val="hi_IN" w:bidi="hi_IN"/>
+        </w:rPr>
+        <w:t>दस साल के बाद जब एलीमेलेक और नाओमी मोआब देश में आए, उनके दोनों पुत्र महलोन और किल्योन मर गए।</w:t>
+      </w:r>
+      <w:r>
+        <w:rPr>
+          <w:lang w:val="hi_IN" w:bidi="hi_IN"/>
+        </w:rPr>
+      </w:r>
+      <w:r>
+        <w:rPr>
+          <w:lang w:val="hi_IN" w:bidi="hi_IN"/>
+        </w:rPr>
+      </w:r>
+    </w:p>
+    <w:p>
+      <w:pPr/>
+      <w:r>
+        <w:rPr>
+          <w:lang w:val="hi_IN" w:bidi="hi_IN"/>
+        </w:rPr>
+      </w:r>
+    </w:p>
+    <w:p>
+      <w:pPr>
+        <w:pStyle w:val="Heading2"/>
+      </w:pPr>
+      <w:r>
+        <w:rPr>
+          <w:lang w:val="hi_IN" w:bidi="hi_IN"/>
+        </w:rPr>
         <w:t>रूत 1:5 (#1)</w:t>
       </w:r>
       <w:r>
@@ -2454,6 +2580,69 @@
         <w:rPr>
           <w:lang w:val="hi_IN" w:bidi="hi_IN"/>
         </w:rPr>
+        <w:t>रूत 1:6 (#3)</w:t>
+      </w:r>
+      <w:r>
+        <w:rPr>
+          <w:lang w:val="hi_IN" w:bidi="hi_IN"/>
+        </w:rPr>
+      </w:r>
+    </w:p>
+    <w:p>
+      <w:pPr/>
+      <w:r>
+        <w:rPr>
+          <w:lang w:val="hi_IN" w:bidi="hi_IN"/>
+        </w:rPr>
+      </w:r>
+      <w:r>
+        <w:rPr>
+          <w:b/>
+          <w:lang w:val="hi_IN" w:bidi="hi_IN"/>
+        </w:rPr>
+        <w:t>"यहोवा"</w:t>
+      </w:r>
+    </w:p>
+    <w:p>
+      <w:pPr/>
+      <w:r>
+        <w:rPr>
+          <w:lang w:val="hi_IN" w:bidi="hi_IN"/>
+        </w:rPr>
+      </w:r>
+      <w:r>
+        <w:rPr>
+          <w:lang w:val="hi_IN" w:bidi="hi_IN"/>
+        </w:rPr>
+        <w:t>यह परमेश्वर का नाम है जो उस ने पुराने नियम में अपनी प्रजा पर प्रकट किया।</w:t>
+      </w:r>
+      <w:r>
+        <w:rPr>
+          <w:lang w:val="hi_IN" w:bidi="hi_IN"/>
+        </w:rPr>
+      </w:r>
+      <w:r>
+        <w:rPr>
+          <w:lang w:val="hi_IN" w:bidi="hi_IN"/>
+        </w:rPr>
+      </w:r>
+    </w:p>
+    <w:p>
+      <w:pPr/>
+      <w:r>
+        <w:rPr>
+          <w:lang w:val="hi_IN" w:bidi="hi_IN"/>
+        </w:rPr>
+      </w:r>
+    </w:p>
+    <w:p>
+      <w:pPr>
+        <w:pStyle w:val="Heading2"/>
+      </w:pPr>
+      <w:r>
+        <w:rPr>
+          <w:lang w:val="hi_IN" w:bidi="hi_IN"/>
+        </w:rPr>
         <w:t>रूत 1:7 (#1)</w:t>
       </w:r>
       <w:r>
@@ -3213,6 +3402,160 @@
         <w:rPr>
           <w:lang w:val="hi_IN" w:bidi="hi_IN"/>
         </w:rPr>
+        <w:t>रूत 1:8 (#4)</w:t>
+      </w:r>
+      <w:r>
+        <w:rPr>
+          <w:lang w:val="hi_IN" w:bidi="hi_IN"/>
+        </w:rPr>
+      </w:r>
+    </w:p>
+    <w:p>
+      <w:pPr/>
+      <w:r>
+        <w:rPr>
+          <w:lang w:val="hi_IN" w:bidi="hi_IN"/>
+        </w:rPr>
+      </w:r>
+      <w:r>
+        <w:rPr>
+          <w:b/>
+          <w:lang w:val="hi_IN" w:bidi="hi_IN"/>
+        </w:rPr>
+        <w:t>"प्रीति"</w:t>
+      </w:r>
+    </w:p>
+    <w:p>
+      <w:pPr/>
+      <w:r>
+        <w:rPr>
+          <w:lang w:val="hi_IN" w:bidi="hi_IN"/>
+        </w:rPr>
+      </w:r>
+      <w:r>
+        <w:rPr>
+          <w:b/>
+          <w:lang w:val="hi_IN" w:bidi="hi_IN"/>
+        </w:rPr>
+        <w:t>वाचा प्रति विश्वसनीयता</w:t>
+      </w:r>
+      <w:r>
+        <w:rPr>
+          <w:lang w:val="hi_IN" w:bidi="hi_IN"/>
+        </w:rPr>
+        <w:t xml:space="preserve"> ऐसा व्यक्ति जो किसी व्यक्ति के लिए अपने सभी दायित्वों और निष्ठाओं को पूरा कर रहा है। प्रस्तावना में चर्चा को देखें।</w:t>
+      </w:r>
+      <w:r>
+        <w:rPr>
+          <w:lang w:val="hi_IN" w:bidi="hi_IN"/>
+        </w:rPr>
+      </w:r>
+      <w:r>
+        <w:rPr>
+          <w:lang w:val="hi_IN" w:bidi="hi_IN"/>
+        </w:rPr>
+      </w:r>
+    </w:p>
+    <w:p>
+      <w:pPr/>
+      <w:r>
+        <w:rPr>
+          <w:lang w:val="hi_IN" w:bidi="hi_IN"/>
+        </w:rPr>
+      </w:r>
+    </w:p>
+    <w:p>
+      <w:pPr>
+        <w:pStyle w:val="Heading2"/>
+      </w:pPr>
+      <w:r>
+        <w:rPr>
+          <w:lang w:val="hi_IN" w:bidi="hi_IN"/>
+        </w:rPr>
+        <w:t>रूत 1:8 (#5)</w:t>
+      </w:r>
+      <w:r>
+        <w:rPr>
+          <w:lang w:val="hi_IN" w:bidi="hi_IN"/>
+        </w:rPr>
+      </w:r>
+    </w:p>
+    <w:p>
+      <w:pPr/>
+      <w:r>
+        <w:rPr>
+          <w:lang w:val="hi_IN" w:bidi="hi_IN"/>
+        </w:rPr>
+      </w:r>
+      <w:r>
+        <w:rPr>
+          <w:b/>
+          <w:lang w:val="hi_IN" w:bidi="hi_IN"/>
+        </w:rPr>
+        <w:t>"मर"</w:t>
+      </w:r>
+    </w:p>
+    <w:p>
+      <w:pPr/>
+      <w:r>
+        <w:rPr>
+          <w:lang w:val="hi_IN" w:bidi="hi_IN"/>
+        </w:rPr>
+      </w:r>
+      <w:r>
+        <w:rPr>
+          <w:b/>
+          <w:lang w:val="hi_IN" w:bidi="hi_IN"/>
+        </w:rPr>
+        <w:t>अपने पतियों से, जो मर गए हैं</w:t>
+      </w:r>
+      <w:r>
+        <w:rPr>
+          <w:lang w:val="hi_IN" w:bidi="hi_IN"/>
+        </w:rPr>
+        <w:t>l नाओमी अपने मरे हुए दोनों पुत्रों का जिक्र कर रही थी।</w:t>
+      </w:r>
+    </w:p>
+    <w:p>
+      <w:pPr/>
+      <w:r>
+        <w:rPr>
+          <w:lang w:val="hi_IN" w:bidi="hi_IN"/>
+        </w:rPr>
+      </w:r>
+      <w:r>
+        <w:rPr>
+          <w:lang w:val="hi_IN" w:bidi="hi_IN"/>
+        </w:rPr>
+        <w:t>देखें: मुहावरा</w:t>
+      </w:r>
+      <w:r>
+        <w:rPr>
+          <w:lang w:val="hi_IN" w:bidi="hi_IN"/>
+        </w:rPr>
+      </w:r>
+      <w:r>
+        <w:rPr>
+          <w:lang w:val="hi_IN" w:bidi="hi_IN"/>
+        </w:rPr>
+      </w:r>
+    </w:p>
+    <w:p>
+      <w:pPr/>
+      <w:r>
+        <w:rPr>
+          <w:lang w:val="hi_IN" w:bidi="hi_IN"/>
+        </w:rPr>
+      </w:r>
+    </w:p>
+    <w:p>
+      <w:pPr>
+        <w:pStyle w:val="Heading2"/>
+      </w:pPr>
+      <w:r>
+        <w:rPr>
+          <w:lang w:val="hi_IN" w:bidi="hi_IN"/>
+        </w:rPr>
         <w:t>रूत 1:9 (#1)</w:t>
       </w:r>
       <w:r>
@@ -6679,6 +7022,83 @@
         <w:rPr>
           <w:lang w:val="hi_IN" w:bidi="hi_IN"/>
         </w:rPr>
+        <w:t>रूत 1:17 (#1)</w:t>
+      </w:r>
+      <w:r>
+        <w:rPr>
+          <w:lang w:val="hi_IN" w:bidi="hi_IN"/>
+        </w:rPr>
+      </w:r>
+    </w:p>
+    <w:p>
+      <w:pPr/>
+      <w:r>
+        <w:rPr>
+          <w:lang w:val="hi_IN" w:bidi="hi_IN"/>
+        </w:rPr>
+      </w:r>
+      <w:r>
+        <w:rPr>
+          <w:b/>
+          <w:lang w:val="hi_IN" w:bidi="hi_IN"/>
+        </w:rPr>
+        <w:t>"जहाँ तू मरेगी"</w:t>
+      </w:r>
+    </w:p>
+    <w:p>
+      <w:pPr/>
+      <w:r>
+        <w:rPr>
+          <w:lang w:val="hi_IN" w:bidi="hi_IN"/>
+        </w:rPr>
+      </w:r>
+      <w:r>
+        <w:rPr>
+          <w:lang w:val="hi_IN" w:bidi="hi_IN"/>
+        </w:rPr>
+        <w:t>यह इस इच्छा को संदर्भित करता है कि रूत जीवनभर नाओमी के साथ उसी नगर में जीवन व्यतीत करना चाहती थी।</w:t>
+      </w:r>
+    </w:p>
+    <w:p>
+      <w:pPr/>
+      <w:r>
+        <w:rPr>
+          <w:lang w:val="hi_IN" w:bidi="hi_IN"/>
+        </w:rPr>
+      </w:r>
+      <w:r>
+        <w:rPr>
+          <w:lang w:val="hi_IN" w:bidi="hi_IN"/>
+        </w:rPr>
+        <w:t>देखें: मुहावरा</w:t>
+      </w:r>
+      <w:r>
+        <w:rPr>
+          <w:lang w:val="hi_IN" w:bidi="hi_IN"/>
+        </w:rPr>
+      </w:r>
+      <w:r>
+        <w:rPr>
+          <w:lang w:val="hi_IN" w:bidi="hi_IN"/>
+        </w:rPr>
+      </w:r>
+    </w:p>
+    <w:p>
+      <w:pPr/>
+      <w:r>
+        <w:rPr>
+          <w:lang w:val="hi_IN" w:bidi="hi_IN"/>
+        </w:rPr>
+      </w:r>
+    </w:p>
+    <w:p>
+      <w:pPr>
+        <w:pStyle w:val="Heading2"/>
+      </w:pPr>
+      <w:r>
+        <w:rPr>
+          <w:lang w:val="hi_IN" w:bidi="hi_IN"/>
+        </w:rPr>
         <w:t>रूत 1:18 (#1)</w:t>
       </w:r>
       <w:r>
@@ -9306,6 +9726,173 @@
         <w:rPr>
           <w:lang w:val="hi_IN" w:bidi="hi_IN"/>
         </w:rPr>
+        <w:t>रूत 2:2 (#3)</w:t>
+      </w:r>
+      <w:r>
+        <w:rPr>
+          <w:lang w:val="hi_IN" w:bidi="hi_IN"/>
+        </w:rPr>
+      </w:r>
+    </w:p>
+    <w:p>
+      <w:pPr/>
+      <w:r>
+        <w:rPr>
+          <w:lang w:val="hi_IN" w:bidi="hi_IN"/>
+        </w:rPr>
+      </w:r>
+      <w:r>
+        <w:rPr>
+          <w:b/>
+          <w:lang w:val="hi_IN" w:bidi="hi_IN"/>
+        </w:rPr>
+        <w:t>"सिला बीनती"</w:t>
+      </w:r>
+    </w:p>
+    <w:p>
+      <w:pPr/>
+      <w:r>
+        <w:rPr>
+          <w:lang w:val="hi_IN" w:bidi="hi_IN"/>
+        </w:rPr>
+      </w:r>
+      <w:r>
+        <w:rPr>
+          <w:b/>
+          <w:lang w:val="hi_IN" w:bidi="hi_IN"/>
+        </w:rPr>
+        <w:t>और लवनेवालो के पीछे पीछे मैं सिला बीनती जाऊं</w:t>
+      </w:r>
+      <w:r>
+        <w:rPr>
+          <w:lang w:val="hi_IN" w:bidi="hi_IN"/>
+        </w:rPr>
+        <w:t xml:space="preserve"> या </w:t>
+      </w:r>
+      <w:r>
+        <w:rPr>
+          <w:b/>
+          <w:lang w:val="hi_IN" w:bidi="hi_IN"/>
+        </w:rPr>
+        <w:t>और लवनेवालो के पीछे जो अनाज के पूले छुट जाते हैं उन्हें बटोरूँ</w:t>
+      </w:r>
+      <w:r>
+        <w:rPr>
+          <w:lang w:val="hi_IN" w:bidi="hi_IN"/>
+        </w:rPr>
+      </w:r>
+      <w:r>
+        <w:rPr>
+          <w:lang w:val="hi_IN" w:bidi="hi_IN"/>
+        </w:rPr>
+      </w:r>
+    </w:p>
+    <w:p>
+      <w:pPr/>
+      <w:r>
+        <w:rPr>
+          <w:lang w:val="hi_IN" w:bidi="hi_IN"/>
+        </w:rPr>
+      </w:r>
+    </w:p>
+    <w:p>
+      <w:pPr>
+        <w:pStyle w:val="Heading2"/>
+      </w:pPr>
+      <w:r>
+        <w:rPr>
+          <w:lang w:val="hi_IN" w:bidi="hi_IN"/>
+        </w:rPr>
+        <w:t>रूत 2:2 (#5)</w:t>
+      </w:r>
+      <w:r>
+        <w:rPr>
+          <w:lang w:val="hi_IN" w:bidi="hi_IN"/>
+        </w:rPr>
+      </w:r>
+    </w:p>
+    <w:p>
+      <w:pPr/>
+      <w:r>
+        <w:rPr>
+          <w:lang w:val="hi_IN" w:bidi="hi_IN"/>
+        </w:rPr>
+      </w:r>
+      <w:r>
+        <w:rPr>
+          <w:b/>
+          <w:lang w:val="hi_IN" w:bidi="hi_IN"/>
+        </w:rPr>
+        <w:t>"दृष्टि"</w:t>
+      </w:r>
+    </w:p>
+    <w:p>
+      <w:pPr/>
+      <w:r>
+        <w:rPr>
+          <w:lang w:val="hi_IN" w:bidi="hi_IN"/>
+        </w:rPr>
+      </w:r>
+      <w:r>
+        <w:rPr>
+          <w:lang w:val="hi_IN" w:bidi="hi_IN"/>
+        </w:rPr>
+        <w:t>"</w:t>
+      </w:r>
+      <w:r>
+        <w:rPr>
+          <w:b/>
+          <w:lang w:val="hi_IN" w:bidi="hi_IN"/>
+        </w:rPr>
+        <w:t>दृष्टि</w:t>
+      </w:r>
+      <w:r>
+        <w:rPr>
+          <w:lang w:val="hi_IN" w:bidi="hi_IN"/>
+        </w:rPr>
+        <w:t xml:space="preserve"> एक ऐसा नाम है जो देखने को दर्शाता है, और देखना - ज्ञान, ध्यान, देखरेख या निर्णय के लिए एक रूपक है। वैकल्पिक अनुवाद: ""कौन मुझ पर [दयालु होने के लिए] ""</w:t>
+      </w:r>
+    </w:p>
+    <w:p>
+      <w:pPr/>
+      <w:r>
+        <w:rPr>
+          <w:lang w:val="hi_IN" w:bidi="hi_IN"/>
+        </w:rPr>
+      </w:r>
+      <w:r>
+        <w:rPr>
+          <w:lang w:val="hi_IN" w:bidi="hi_IN"/>
+        </w:rPr>
+        <w:t>देखें: रूपक</w:t>
+      </w:r>
+      <w:r>
+        <w:rPr>
+          <w:lang w:val="hi_IN" w:bidi="hi_IN"/>
+        </w:rPr>
+      </w:r>
+      <w:r>
+        <w:rPr>
+          <w:lang w:val="hi_IN" w:bidi="hi_IN"/>
+        </w:rPr>
+      </w:r>
+    </w:p>
+    <w:p>
+      <w:pPr/>
+      <w:r>
+        <w:rPr>
+          <w:lang w:val="hi_IN" w:bidi="hi_IN"/>
+        </w:rPr>
+      </w:r>
+    </w:p>
+    <w:p>
+      <w:pPr>
+        <w:pStyle w:val="Heading2"/>
+      </w:pPr>
+      <w:r>
+        <w:rPr>
+          <w:lang w:val="hi_IN" w:bidi="hi_IN"/>
+        </w:rPr>
         <w:t>रूत 2:3 (#1)</w:t>
       </w:r>
       <w:r>
@@ -10016,6 +10603,82 @@
         <w:rPr>
           <w:lang w:val="hi_IN" w:bidi="hi_IN"/>
         </w:rPr>
+        <w:t>रूत 2:5 (#2)</w:t>
+      </w:r>
+      <w:r>
+        <w:rPr>
+          <w:lang w:val="hi_IN" w:bidi="hi_IN"/>
+        </w:rPr>
+      </w:r>
+    </w:p>
+    <w:p>
+      <w:pPr/>
+      <w:r>
+        <w:rPr>
+          <w:lang w:val="hi_IN" w:bidi="hi_IN"/>
+        </w:rPr>
+      </w:r>
+      <w:r>
+        <w:rPr>
+          <w:b/>
+          <w:lang w:val="hi_IN" w:bidi="hi_IN"/>
+        </w:rPr>
+        <w:t>"सेवक"</w:t>
+      </w:r>
+    </w:p>
+    <w:p>
+      <w:pPr/>
+      <w:r>
+        <w:rPr>
+          <w:lang w:val="hi_IN" w:bidi="hi_IN"/>
+        </w:rPr>
+      </w:r>
+      <w:r>
+        <w:rPr>
+          <w:lang w:val="hi_IN" w:bidi="hi_IN"/>
+        </w:rPr>
+        <w:t xml:space="preserve">यह </w:t>
+      </w:r>
+      <w:r>
+        <w:rPr>
+          <w:b/>
+          <w:lang w:val="hi_IN" w:bidi="hi_IN"/>
+        </w:rPr>
+        <w:t>सेवक</w:t>
+      </w:r>
+      <w:r>
+        <w:rPr>
+          <w:lang w:val="hi_IN" w:bidi="hi_IN"/>
+        </w:rPr>
+        <w:t xml:space="preserve"> एक युवा पुरुष था जो बोअज के लिए काम करता था और जिसने बोअज के बाकी सेवकों को बताया कि उन्होंने क्या करना है।</w:t>
+      </w:r>
+      <w:r>
+        <w:rPr>
+          <w:lang w:val="hi_IN" w:bidi="hi_IN"/>
+        </w:rPr>
+      </w:r>
+      <w:r>
+        <w:rPr>
+          <w:lang w:val="hi_IN" w:bidi="hi_IN"/>
+        </w:rPr>
+      </w:r>
+    </w:p>
+    <w:p>
+      <w:pPr/>
+      <w:r>
+        <w:rPr>
+          <w:lang w:val="hi_IN" w:bidi="hi_IN"/>
+        </w:rPr>
+      </w:r>
+    </w:p>
+    <w:p>
+      <w:pPr>
+        <w:pStyle w:val="Heading2"/>
+      </w:pPr>
+      <w:r>
+        <w:rPr>
+          <w:lang w:val="hi_IN" w:bidi="hi_IN"/>
+        </w:rPr>
         <w:t>रूत 2:6 (#1)</w:t>
       </w:r>
       <w:r>
@@ -10429,6 +11092,76 @@
         <w:rPr>
           <w:lang w:val="hi_IN" w:bidi="hi_IN"/>
         </w:rPr>
+        <w:t>रूत 2:7 (#1)</w:t>
+      </w:r>
+      <w:r>
+        <w:rPr>
+          <w:lang w:val="hi_IN" w:bidi="hi_IN"/>
+        </w:rPr>
+      </w:r>
+    </w:p>
+    <w:p>
+      <w:pPr/>
+      <w:r>
+        <w:rPr>
+          <w:lang w:val="hi_IN" w:bidi="hi_IN"/>
+        </w:rPr>
+      </w:r>
+      <w:r>
+        <w:rPr>
+          <w:b/>
+          <w:lang w:val="hi_IN" w:bidi="hi_IN"/>
+        </w:rPr>
+        <w:t>"बीनने"</w:t>
+      </w:r>
+    </w:p>
+    <w:p>
+      <w:pPr/>
+      <w:r>
+        <w:rPr>
+          <w:lang w:val="hi_IN" w:bidi="hi_IN"/>
+        </w:rPr>
+      </w:r>
+      <w:r>
+        <w:rPr>
+          <w:b/>
+          <w:lang w:val="hi_IN" w:bidi="hi_IN"/>
+        </w:rPr>
+        <w:t>बीनने</w:t>
+      </w:r>
+      <w:r>
+        <w:rPr>
+          <w:lang w:val="hi_IN" w:bidi="hi_IN"/>
+        </w:rPr>
+        <w:t xml:space="preserve"> का अर्थ अनाज या अन्य उपज को उठाना जो मजदूरों से गिर गया या कटाई के समय उनसे रह गया। यह उस व्यवस्था का हिस्सा था जो परमेश्वर ने मूसा को दी थी, कि मज़दूर इस उपज के लिए खेत में वापस न जाएं, ताकि इसे गरीबों या परदेशियों के लिए बीनने के छोड़ दिया जाए। लैव्यव्यवस्था 19:10 और व्यवस्थाविवरण 24:21 जैसे पद देखें।</w:t>
+      </w:r>
+      <w:r>
+        <w:rPr>
+          <w:lang w:val="hi_IN" w:bidi="hi_IN"/>
+        </w:rPr>
+      </w:r>
+      <w:r>
+        <w:rPr>
+          <w:lang w:val="hi_IN" w:bidi="hi_IN"/>
+        </w:rPr>
+      </w:r>
+    </w:p>
+    <w:p>
+      <w:pPr/>
+      <w:r>
+        <w:rPr>
+          <w:lang w:val="hi_IN" w:bidi="hi_IN"/>
+        </w:rPr>
+      </w:r>
+    </w:p>
+    <w:p>
+      <w:pPr>
+        <w:pStyle w:val="Heading2"/>
+      </w:pPr>
+      <w:r>
+        <w:rPr>
+          <w:lang w:val="hi_IN" w:bidi="hi_IN"/>
+        </w:rPr>
         <w:t>रूत 2:8 (#1)</w:t>
       </w:r>
       <w:r>
@@ -11684,6 +12417,172 @@
         <w:rPr>
           <w:lang w:val="hi_IN" w:bidi="hi_IN"/>
         </w:rPr>
+        <w:t>रूत 2:10 (#6)</w:t>
+      </w:r>
+      <w:r>
+        <w:rPr>
+          <w:lang w:val="hi_IN" w:bidi="hi_IN"/>
+        </w:rPr>
+      </w:r>
+    </w:p>
+    <w:p>
+      <w:pPr/>
+      <w:r>
+        <w:rPr>
+          <w:lang w:val="hi_IN" w:bidi="hi_IN"/>
+        </w:rPr>
+      </w:r>
+      <w:r>
+        <w:rPr>
+          <w:b/>
+          <w:lang w:val="hi_IN" w:bidi="hi_IN"/>
+        </w:rPr>
+        <w:t>"दृष्टि"</w:t>
+      </w:r>
+    </w:p>
+    <w:p>
+      <w:pPr/>
+      <w:r>
+        <w:rPr>
+          <w:lang w:val="hi_IN" w:bidi="hi_IN"/>
+        </w:rPr>
+      </w:r>
+      <w:r>
+        <w:rPr>
+          <w:lang w:val="hi_IN" w:bidi="hi_IN"/>
+        </w:rPr>
+        <w:t>"</w:t>
+      </w:r>
+      <w:r>
+        <w:rPr>
+          <w:b/>
+          <w:lang w:val="hi_IN" w:bidi="hi_IN"/>
+        </w:rPr>
+        <w:t>दृष्टि</w:t>
+      </w:r>
+      <w:r>
+        <w:rPr>
+          <w:lang w:val="hi_IN" w:bidi="hi_IN"/>
+        </w:rPr>
+        <w:t xml:space="preserve"> एक ऐसा नाम है जो देखेंने को दर्शाता है, और देखना - ज्ञान, ध्यान, देखरेख या निर्णय के लिए एक रूपक है। वैकल्पिक अनुवाद: ""आपके फैसले में"" या ""आपने जो फैसला किया""</w:t>
+      </w:r>
+    </w:p>
+    <w:p>
+      <w:pPr/>
+      <w:r>
+        <w:rPr>
+          <w:lang w:val="hi_IN" w:bidi="hi_IN"/>
+        </w:rPr>
+      </w:r>
+      <w:r>
+        <w:rPr>
+          <w:lang w:val="hi_IN" w:bidi="hi_IN"/>
+        </w:rPr>
+        <w:t>देखें: रूपक</w:t>
+      </w:r>
+      <w:r>
+        <w:rPr>
+          <w:lang w:val="hi_IN" w:bidi="hi_IN"/>
+        </w:rPr>
+      </w:r>
+      <w:r>
+        <w:rPr>
+          <w:lang w:val="hi_IN" w:bidi="hi_IN"/>
+        </w:rPr>
+      </w:r>
+    </w:p>
+    <w:p>
+      <w:pPr/>
+      <w:r>
+        <w:rPr>
+          <w:lang w:val="hi_IN" w:bidi="hi_IN"/>
+        </w:rPr>
+      </w:r>
+    </w:p>
+    <w:p>
+      <w:pPr>
+        <w:pStyle w:val="Heading2"/>
+      </w:pPr>
+      <w:r>
+        <w:rPr>
+          <w:lang w:val="hi_IN" w:bidi="hi_IN"/>
+        </w:rPr>
+        <w:t>रूत 2:10 (#7)</w:t>
+      </w:r>
+      <w:r>
+        <w:rPr>
+          <w:lang w:val="hi_IN" w:bidi="hi_IN"/>
+        </w:rPr>
+      </w:r>
+    </w:p>
+    <w:p>
+      <w:pPr/>
+      <w:r>
+        <w:rPr>
+          <w:lang w:val="hi_IN" w:bidi="hi_IN"/>
+        </w:rPr>
+      </w:r>
+      <w:r>
+        <w:rPr>
+          <w:b/>
+          <w:lang w:val="hi_IN" w:bidi="hi_IN"/>
+        </w:rPr>
+        <w:t>""</w:t>
+      </w:r>
+    </w:p>
+    <w:p>
+      <w:pPr/>
+      <w:r>
+        <w:rPr>
+          <w:lang w:val="hi_IN" w:bidi="hi_IN"/>
+        </w:rPr>
+      </w:r>
+      <w:r>
+        <w:rPr>
+          <w:lang w:val="hi_IN" w:bidi="hi_IN"/>
+        </w:rPr>
+        <w:t xml:space="preserve">एक </w:t>
+      </w:r>
+      <w:r>
+        <w:rPr>
+          <w:b/>
+          <w:lang w:val="hi_IN" w:bidi="hi_IN"/>
+        </w:rPr>
+        <w:t>परदेशिन</w:t>
+      </w:r>
+      <w:r>
+        <w:rPr>
+          <w:lang w:val="hi_IN" w:bidi="hi_IN"/>
+        </w:rPr>
+        <w:t xml:space="preserve"> वह जो किसी दूसरे देश से है। भले ही रूत ने निजी तौर पर इस्राएल के परमेश्वर के प्रति अपनी वफादारी की प्रतिज्ञा की, लेकिन सभी जानते थे कि वह मोआब से थी, न कि इस्राएल से। अक्सर इस्राएली विदेशियों के प्रति दयालु नहीं थे, भले ही परमेश्वर चाहते थे कि वे उन पर दया करें। इससे पता चलता है कि बोअज परमेश्वर को प्रसन्न करने के लिए जीवन व्यतीत कर रहा था।</w:t>
+      </w:r>
+      <w:r>
+        <w:rPr>
+          <w:lang w:val="hi_IN" w:bidi="hi_IN"/>
+        </w:rPr>
+      </w:r>
+      <w:r>
+        <w:rPr>
+          <w:lang w:val="hi_IN" w:bidi="hi_IN"/>
+        </w:rPr>
+      </w:r>
+    </w:p>
+    <w:p>
+      <w:pPr/>
+      <w:r>
+        <w:rPr>
+          <w:lang w:val="hi_IN" w:bidi="hi_IN"/>
+        </w:rPr>
+      </w:r>
+    </w:p>
+    <w:p>
+      <w:pPr>
+        <w:pStyle w:val="Heading2"/>
+      </w:pPr>
+      <w:r>
+        <w:rPr>
+          <w:lang w:val="hi_IN" w:bidi="hi_IN"/>
+        </w:rPr>
         <w:t>रूत 2:11 (#1)</w:t>
       </w:r>
       <w:r>
@@ -12262,6 +13161,96 @@
         <w:rPr>
           <w:lang w:val="hi_IN" w:bidi="hi_IN"/>
         </w:rPr>
+        <w:t>रूत 2:11 (#3)</w:t>
+      </w:r>
+      <w:r>
+        <w:rPr>
+          <w:lang w:val="hi_IN" w:bidi="hi_IN"/>
+        </w:rPr>
+      </w:r>
+    </w:p>
+    <w:p>
+      <w:pPr/>
+      <w:r>
+        <w:rPr>
+          <w:lang w:val="hi_IN" w:bidi="hi_IN"/>
+        </w:rPr>
+      </w:r>
+      <w:r>
+        <w:rPr>
+          <w:b/>
+          <w:lang w:val="hi_IN" w:bidi="hi_IN"/>
+        </w:rPr>
+        <w:t>""</w:t>
+      </w:r>
+    </w:p>
+    <w:p>
+      <w:pPr/>
+      <w:r>
+        <w:rPr>
+          <w:lang w:val="hi_IN" w:bidi="hi_IN"/>
+        </w:rPr>
+      </w:r>
+      <w:r>
+        <w:rPr>
+          <w:lang w:val="hi_IN" w:bidi="hi_IN"/>
+        </w:rPr>
+        <w:t xml:space="preserve">यहाँ </w:t>
+      </w:r>
+      <w:r>
+        <w:rPr>
+          <w:b/>
+          <w:lang w:val="hi_IN" w:bidi="hi_IN"/>
+        </w:rPr>
+        <w:t>जानकारी / समाचार</w:t>
+      </w:r>
+      <w:r>
+        <w:rPr>
+          <w:lang w:val="hi_IN" w:bidi="hi_IN"/>
+        </w:rPr>
+        <w:t xml:space="preserve"> के लिए मूल इब्रानी पाठ में दो रूप दोहराए गए हैं ताकि कथन की निश्चितता पर जोर दिया जा सके।</w:t>
+      </w:r>
+    </w:p>
+    <w:p>
+      <w:pPr/>
+      <w:r>
+        <w:rPr>
+          <w:lang w:val="hi_IN" w:bidi="hi_IN"/>
+        </w:rPr>
+      </w:r>
+      <w:r>
+        <w:rPr>
+          <w:lang w:val="hi_IN" w:bidi="hi_IN"/>
+        </w:rPr>
+        <w:t>देखें: मुहावरा</w:t>
+      </w:r>
+      <w:r>
+        <w:rPr>
+          <w:lang w:val="hi_IN" w:bidi="hi_IN"/>
+        </w:rPr>
+      </w:r>
+      <w:r>
+        <w:rPr>
+          <w:lang w:val="hi_IN" w:bidi="hi_IN"/>
+        </w:rPr>
+      </w:r>
+    </w:p>
+    <w:p>
+      <w:pPr/>
+      <w:r>
+        <w:rPr>
+          <w:lang w:val="hi_IN" w:bidi="hi_IN"/>
+        </w:rPr>
+      </w:r>
+    </w:p>
+    <w:p>
+      <w:pPr>
+        <w:pStyle w:val="Heading2"/>
+      </w:pPr>
+      <w:r>
+        <w:rPr>
+          <w:lang w:val="hi_IN" w:bidi="hi_IN"/>
+        </w:rPr>
         <w:t>रूत 2:12 (#2)</w:t>
       </w:r>
       <w:r>
@@ -12514,6 +13503,83 @@
         <w:rPr>
           <w:lang w:val="hi_IN" w:bidi="hi_IN"/>
         </w:rPr>
+        <w:t>रूत 2:12 (#1)</w:t>
+      </w:r>
+      <w:r>
+        <w:rPr>
+          <w:lang w:val="hi_IN" w:bidi="hi_IN"/>
+        </w:rPr>
+      </w:r>
+    </w:p>
+    <w:p>
+      <w:pPr/>
+      <w:r>
+        <w:rPr>
+          <w:lang w:val="hi_IN" w:bidi="hi_IN"/>
+        </w:rPr>
+      </w:r>
+      <w:r>
+        <w:rPr>
+          <w:b/>
+          <w:lang w:val="hi_IN" w:bidi="hi_IN"/>
+        </w:rPr>
+        <w:t>""यहोवा करनी"</w:t>
+      </w:r>
+    </w:p>
+    <w:p>
+      <w:pPr/>
+      <w:r>
+        <w:rPr>
+          <w:lang w:val="hi_IN" w:bidi="hi_IN"/>
+        </w:rPr>
+      </w:r>
+      <w:r>
+        <w:rPr>
+          <w:b/>
+          <w:lang w:val="hi_IN" w:bidi="hi_IN"/>
+        </w:rPr>
+        <w:t>यहोवा तुझे फल दे</w:t>
+      </w:r>
+      <w:r>
+        <w:rPr>
+          <w:lang w:val="hi_IN" w:bidi="hi_IN"/>
+        </w:rPr>
+        <w:t xml:space="preserve"> या </w:t>
+      </w:r>
+      <w:r>
+        <w:rPr>
+          <w:b/>
+          <w:lang w:val="hi_IN" w:bidi="hi_IN"/>
+        </w:rPr>
+        <w:t>यहोवा तुझे बदला दे</w:t>
+      </w:r>
+      <w:r>
+        <w:rPr>
+          <w:lang w:val="hi_IN" w:bidi="hi_IN"/>
+        </w:rPr>
+      </w:r>
+      <w:r>
+        <w:rPr>
+          <w:lang w:val="hi_IN" w:bidi="hi_IN"/>
+        </w:rPr>
+      </w:r>
+    </w:p>
+    <w:p>
+      <w:pPr/>
+      <w:r>
+        <w:rPr>
+          <w:lang w:val="hi_IN" w:bidi="hi_IN"/>
+        </w:rPr>
+      </w:r>
+    </w:p>
+    <w:p>
+      <w:pPr>
+        <w:pStyle w:val="Heading2"/>
+      </w:pPr>
+      <w:r>
+        <w:rPr>
+          <w:lang w:val="hi_IN" w:bidi="hi_IN"/>
+        </w:rPr>
         <w:t>रूत 2:13 (#1)</w:t>
       </w:r>
       <w:r>
@@ -13089,6 +14155,83 @@
         <w:rPr>
           <w:lang w:val="hi_IN" w:bidi="hi_IN"/>
         </w:rPr>
+        <w:t>रूत 2:13 (#2)</w:t>
+      </w:r>
+      <w:r>
+        <w:rPr>
+          <w:lang w:val="hi_IN" w:bidi="hi_IN"/>
+        </w:rPr>
+      </w:r>
+    </w:p>
+    <w:p>
+      <w:pPr/>
+      <w:r>
+        <w:rPr>
+          <w:lang w:val="hi_IN" w:bidi="hi_IN"/>
+        </w:rPr>
+      </w:r>
+      <w:r>
+        <w:rPr>
+          <w:b/>
+          <w:lang w:val="hi_IN" w:bidi="hi_IN"/>
+        </w:rPr>
+        <w:t>"दृष्टि"</w:t>
+      </w:r>
+    </w:p>
+    <w:p>
+      <w:pPr/>
+      <w:r>
+        <w:rPr>
+          <w:lang w:val="hi_IN" w:bidi="hi_IN"/>
+        </w:rPr>
+      </w:r>
+      <w:r>
+        <w:rPr>
+          <w:lang w:val="hi_IN" w:bidi="hi_IN"/>
+        </w:rPr>
+        <w:t>"** आंखें ** एक ऐसा अनुनाम है जो देखने को दर्शाता है, और देखेंना ज्ञान, नोटिस, ध्यान या निर्णय के लिए एक अलंकार है। वैकल्पिक अनुवाद: ""और मुझे स्वीकार करो""</w:t>
+      </w:r>
+    </w:p>
+    <w:p>
+      <w:pPr/>
+      <w:r>
+        <w:rPr>
+          <w:lang w:val="hi_IN" w:bidi="hi_IN"/>
+        </w:rPr>
+      </w:r>
+      <w:r>
+        <w:rPr>
+          <w:lang w:val="hi_IN" w:bidi="hi_IN"/>
+        </w:rPr>
+        <w:t>देखें: रूपक</w:t>
+      </w:r>
+      <w:r>
+        <w:rPr>
+          <w:lang w:val="hi_IN" w:bidi="hi_IN"/>
+        </w:rPr>
+      </w:r>
+      <w:r>
+        <w:rPr>
+          <w:lang w:val="hi_IN" w:bidi="hi_IN"/>
+        </w:rPr>
+      </w:r>
+    </w:p>
+    <w:p>
+      <w:pPr/>
+      <w:r>
+        <w:rPr>
+          <w:lang w:val="hi_IN" w:bidi="hi_IN"/>
+        </w:rPr>
+      </w:r>
+    </w:p>
+    <w:p>
+      <w:pPr>
+        <w:pStyle w:val="Heading2"/>
+      </w:pPr>
+      <w:r>
+        <w:rPr>
+          <w:lang w:val="hi_IN" w:bidi="hi_IN"/>
+        </w:rPr>
         <w:t>रूत 2:14 (#1)</w:t>
       </w:r>
       <w:r>
@@ -13475,6 +14618,76 @@
         <w:rPr>
           <w:lang w:val="hi_IN" w:bidi="hi_IN"/>
         </w:rPr>
+        <w:t>रूत 2:14 (#3)</w:t>
+      </w:r>
+      <w:r>
+        <w:rPr>
+          <w:lang w:val="hi_IN" w:bidi="hi_IN"/>
+        </w:rPr>
+      </w:r>
+    </w:p>
+    <w:p>
+      <w:pPr/>
+      <w:r>
+        <w:rPr>
+          <w:lang w:val="hi_IN" w:bidi="hi_IN"/>
+        </w:rPr>
+      </w:r>
+      <w:r>
+        <w:rPr>
+          <w:b/>
+          <w:lang w:val="hi_IN" w:bidi="hi_IN"/>
+        </w:rPr>
+        <w:t>"सिरके"</w:t>
+      </w:r>
+    </w:p>
+    <w:p>
+      <w:pPr/>
+      <w:r>
+        <w:rPr>
+          <w:lang w:val="hi_IN" w:bidi="hi_IN"/>
+        </w:rPr>
+      </w:r>
+      <w:r>
+        <w:rPr>
+          <w:b/>
+          <w:lang w:val="hi_IN" w:bidi="hi_IN"/>
+        </w:rPr>
+        <w:t>सिरका</w:t>
+      </w:r>
+      <w:r>
+        <w:rPr>
+          <w:lang w:val="hi_IN" w:bidi="hi_IN"/>
+        </w:rPr>
+        <w:t xml:space="preserve"> एक चटनी थी जिसमें उन्होंने रोटी को डुबोयाl इस्राएलियों ने अंगूर के रस से सिरका बनाया जो अभी दाख्मधू नहीं बना था। सिरका के स्तर पर, रस बहुत खट्टा और अम्लीय हो जाता है।</w:t>
+      </w:r>
+      <w:r>
+        <w:rPr>
+          <w:lang w:val="hi_IN" w:bidi="hi_IN"/>
+        </w:rPr>
+      </w:r>
+      <w:r>
+        <w:rPr>
+          <w:lang w:val="hi_IN" w:bidi="hi_IN"/>
+        </w:rPr>
+      </w:r>
+    </w:p>
+    <w:p>
+      <w:pPr/>
+      <w:r>
+        <w:rPr>
+          <w:lang w:val="hi_IN" w:bidi="hi_IN"/>
+        </w:rPr>
+      </w:r>
+    </w:p>
+    <w:p>
+      <w:pPr>
+        <w:pStyle w:val="Heading2"/>
+      </w:pPr>
+      <w:r>
+        <w:rPr>
+          <w:lang w:val="hi_IN" w:bidi="hi_IN"/>
+        </w:rPr>
         <w:t>रूत 2:15 (#1)</w:t>
       </w:r>
       <w:r>
@@ -13759,6 +14972,70 @@
         <w:rPr>
           <w:lang w:val="hi_IN" w:bidi="hi_IN"/>
         </w:rPr>
+        <w:t>रूत 2:15 (#2)</w:t>
+      </w:r>
+      <w:r>
+        <w:rPr>
+          <w:lang w:val="hi_IN" w:bidi="hi_IN"/>
+        </w:rPr>
+      </w:r>
+    </w:p>
+    <w:p>
+      <w:pPr/>
+      <w:r>
+        <w:rPr>
+          <w:lang w:val="hi_IN" w:bidi="hi_IN"/>
+        </w:rPr>
+      </w:r>
+      <w:r>
+        <w:rPr>
+          <w:b/>
+          <w:lang w:val="hi_IN" w:bidi="hi_IN"/>
+        </w:rPr>
+        <w:t>"उठी"</w:t>
+      </w:r>
+    </w:p>
+    <w:p>
+      <w:pPr/>
+      <w:r>
+        <w:rPr>
+          <w:lang w:val="hi_IN" w:bidi="hi_IN"/>
+        </w:rPr>
+      </w:r>
+      <w:r>
+        <w:rPr>
+          <w:b/>
+          <w:lang w:val="hi_IN" w:bidi="hi_IN"/>
+        </w:rPr>
+        <w:t>जब वह उठी</w:t>
+      </w:r>
+      <w:r>
+        <w:rPr>
+          <w:lang w:val="hi_IN" w:bidi="hi_IN"/>
+        </w:rPr>
+      </w:r>
+      <w:r>
+        <w:rPr>
+          <w:lang w:val="hi_IN" w:bidi="hi_IN"/>
+        </w:rPr>
+      </w:r>
+    </w:p>
+    <w:p>
+      <w:pPr/>
+      <w:r>
+        <w:rPr>
+          <w:lang w:val="hi_IN" w:bidi="hi_IN"/>
+        </w:rPr>
+      </w:r>
+    </w:p>
+    <w:p>
+      <w:pPr>
+        <w:pStyle w:val="Heading2"/>
+      </w:pPr>
+      <w:r>
+        <w:rPr>
+          <w:lang w:val="hi_IN" w:bidi="hi_IN"/>
+        </w:rPr>
         <w:t>रूत 2:16 (#1)</w:t>
       </w:r>
       <w:r>
@@ -14257,6 +15534,83 @@
         <w:rPr>
           <w:lang w:val="hi_IN" w:bidi="hi_IN"/>
         </w:rPr>
+        <w:t>रूत 2:18 (#2)</w:t>
+      </w:r>
+      <w:r>
+        <w:rPr>
+          <w:lang w:val="hi_IN" w:bidi="hi_IN"/>
+        </w:rPr>
+      </w:r>
+    </w:p>
+    <w:p>
+      <w:pPr/>
+      <w:r>
+        <w:rPr>
+          <w:lang w:val="hi_IN" w:bidi="hi_IN"/>
+        </w:rPr>
+      </w:r>
+      <w:r>
+        <w:rPr>
+          <w:b/>
+          <w:lang w:val="hi_IN" w:bidi="hi_IN"/>
+        </w:rPr>
+        <w:t>"सास"</w:t>
+      </w:r>
+      <w:r>
+        <w:rPr>
+          <w:lang w:val="hi_IN" w:bidi="hi_IN"/>
+        </w:rPr>
+        <w:t xml:space="preserve"> - </w:t>
+      </w:r>
+      <w:r>
+        <w:rPr>
+          <w:b/>
+          <w:lang w:val="hi_IN" w:bidi="hi_IN"/>
+        </w:rPr>
+        <w:t>"देखा"</w:t>
+      </w:r>
+    </w:p>
+    <w:p>
+      <w:pPr/>
+      <w:r>
+        <w:rPr>
+          <w:lang w:val="hi_IN" w:bidi="hi_IN"/>
+        </w:rPr>
+      </w:r>
+      <w:r>
+        <w:rPr>
+          <w:b/>
+          <w:lang w:val="hi_IN" w:bidi="hi_IN"/>
+        </w:rPr>
+        <w:t>तब नाओमी ने देखा</w:t>
+      </w:r>
+      <w:r>
+        <w:rPr>
+          <w:lang w:val="hi_IN" w:bidi="hi_IN"/>
+        </w:rPr>
+      </w:r>
+      <w:r>
+        <w:rPr>
+          <w:lang w:val="hi_IN" w:bidi="hi_IN"/>
+        </w:rPr>
+      </w:r>
+    </w:p>
+    <w:p>
+      <w:pPr/>
+      <w:r>
+        <w:rPr>
+          <w:lang w:val="hi_IN" w:bidi="hi_IN"/>
+        </w:rPr>
+      </w:r>
+    </w:p>
+    <w:p>
+      <w:pPr>
+        <w:pStyle w:val="Heading2"/>
+      </w:pPr>
+      <w:r>
+        <w:rPr>
+          <w:lang w:val="hi_IN" w:bidi="hi_IN"/>
+        </w:rPr>
         <w:t>रूत 2:19 (#1)</w:t>
       </w:r>
       <w:r>
@@ -16093,6 +17447,102 @@
         <w:rPr>
           <w:lang w:val="hi_IN" w:bidi="hi_IN"/>
         </w:rPr>
+        <w:t>रूत 2:22 (#3)</w:t>
+      </w:r>
+      <w:r>
+        <w:rPr>
+          <w:lang w:val="hi_IN" w:bidi="hi_IN"/>
+        </w:rPr>
+      </w:r>
+    </w:p>
+    <w:p>
+      <w:pPr/>
+      <w:r>
+        <w:rPr>
+          <w:lang w:val="hi_IN" w:bidi="hi_IN"/>
+        </w:rPr>
+      </w:r>
+      <w:r>
+        <w:rPr>
+          <w:b/>
+          <w:lang w:val="hi_IN" w:bidi="hi_IN"/>
+        </w:rPr>
+        <w:t>"वे तुझको"</w:t>
+      </w:r>
+      <w:r>
+        <w:rPr>
+          <w:lang w:val="hi_IN" w:bidi="hi_IN"/>
+        </w:rPr>
+        <w:t xml:space="preserve"> - </w:t>
+      </w:r>
+      <w:r>
+        <w:rPr>
+          <w:b/>
+          <w:lang w:val="hi_IN" w:bidi="hi_IN"/>
+        </w:rPr>
+        <w:t>"न"</w:t>
+      </w:r>
+    </w:p>
+    <w:p>
+      <w:pPr/>
+      <w:r>
+        <w:rPr>
+          <w:lang w:val="hi_IN" w:bidi="hi_IN"/>
+        </w:rPr>
+      </w:r>
+      <w:r>
+        <w:rPr>
+          <w:lang w:val="hi_IN" w:bidi="hi_IN"/>
+        </w:rPr>
+        <w:t>यही कारण है कि रूत को बोअज के सेवकों के साथ काम करना क्यों जारी रखना चाहिए। यदि परिणाम से पहले कारण बताने के लिए आपकी भाषा में यह अधिक स्पष्ट है, तो आप वाक्य के इस भाग को पहले बता सकते हैं, जैसे कि यू एस टी में किया गया है।</w:t>
+      </w:r>
+    </w:p>
+    <w:p>
+      <w:pPr/>
+      <w:r>
+        <w:rPr>
+          <w:lang w:val="hi_IN" w:bidi="hi_IN"/>
+        </w:rPr>
+      </w:r>
+      <w:r>
+        <w:rPr>
+          <w:lang w:val="hi_IN" w:bidi="hi_IN"/>
+        </w:rPr>
+        <w:t xml:space="preserve">देखें: </w:t>
+      </w:r>
+      <w:r>
+        <w:rPr>
+          <w:lang w:val="hi_IN" w:bidi="hi_IN"/>
+        </w:rPr>
+        <w:t>जोड़ें — कारण और परिणाम संबंध</w:t>
+      </w:r>
+      <w:r>
+        <w:rPr>
+          <w:lang w:val="hi_IN" w:bidi="hi_IN"/>
+        </w:rPr>
+      </w:r>
+      <w:r>
+        <w:rPr>
+          <w:lang w:val="hi_IN" w:bidi="hi_IN"/>
+        </w:rPr>
+      </w:r>
+    </w:p>
+    <w:p>
+      <w:pPr/>
+      <w:r>
+        <w:rPr>
+          <w:lang w:val="hi_IN" w:bidi="hi_IN"/>
+        </w:rPr>
+      </w:r>
+    </w:p>
+    <w:p>
+      <w:pPr>
+        <w:pStyle w:val="Heading2"/>
+      </w:pPr>
+      <w:r>
+        <w:rPr>
+          <w:lang w:val="hi_IN" w:bidi="hi_IN"/>
+        </w:rPr>
         <w:t>रूत 2:23 (#1)</w:t>
       </w:r>
       <w:r>
@@ -16267,6 +17717,69 @@
         <w:rPr>
           <w:lang w:val="hi_IN" w:bidi="hi_IN"/>
         </w:rPr>
+        <w:t>रूत 2:23 (#2)</w:t>
+      </w:r>
+      <w:r>
+        <w:rPr>
+          <w:lang w:val="hi_IN" w:bidi="hi_IN"/>
+        </w:rPr>
+      </w:r>
+    </w:p>
+    <w:p>
+      <w:pPr/>
+      <w:r>
+        <w:rPr>
+          <w:lang w:val="hi_IN" w:bidi="hi_IN"/>
+        </w:rPr>
+      </w:r>
+      <w:r>
+        <w:rPr>
+          <w:b/>
+          <w:lang w:val="hi_IN" w:bidi="hi_IN"/>
+        </w:rPr>
+        <w:t>""अपनी सास"</w:t>
+      </w:r>
+    </w:p>
+    <w:p>
+      <w:pPr/>
+      <w:r>
+        <w:rPr>
+          <w:lang w:val="hi_IN" w:bidi="hi_IN"/>
+        </w:rPr>
+      </w:r>
+      <w:r>
+        <w:rPr>
+          <w:lang w:val="hi_IN" w:bidi="hi_IN"/>
+        </w:rPr>
+        <w:t>रूत रात के समय नाओमी के घर आराम के लिए चली गई।</w:t>
+      </w:r>
+      <w:r>
+        <w:rPr>
+          <w:lang w:val="hi_IN" w:bidi="hi_IN"/>
+        </w:rPr>
+      </w:r>
+      <w:r>
+        <w:rPr>
+          <w:lang w:val="hi_IN" w:bidi="hi_IN"/>
+        </w:rPr>
+      </w:r>
+    </w:p>
+    <w:p>
+      <w:pPr/>
+      <w:r>
+        <w:rPr>
+          <w:lang w:val="hi_IN" w:bidi="hi_IN"/>
+        </w:rPr>
+      </w:r>
+    </w:p>
+    <w:p>
+      <w:pPr>
+        <w:pStyle w:val="Heading2"/>
+      </w:pPr>
+      <w:r>
+        <w:rPr>
+          <w:lang w:val="hi_IN" w:bidi="hi_IN"/>
+        </w:rPr>
         <w:t>रूत - अध्याय 3 परिचय</w:t>
       </w:r>
       <w:r>
@@ -17486,6 +18999,76 @@
         <w:rPr>
           <w:lang w:val="hi_IN" w:bidi="hi_IN"/>
         </w:rPr>
+        <w:t>रूत 3:2 (#5)</w:t>
+      </w:r>
+      <w:r>
+        <w:rPr>
+          <w:lang w:val="hi_IN" w:bidi="hi_IN"/>
+        </w:rPr>
+      </w:r>
+    </w:p>
+    <w:p>
+      <w:pPr/>
+      <w:r>
+        <w:rPr>
+          <w:lang w:val="hi_IN" w:bidi="hi_IN"/>
+        </w:rPr>
+      </w:r>
+      <w:r>
+        <w:rPr>
+          <w:b/>
+          <w:lang w:val="hi_IN" w:bidi="hi_IN"/>
+        </w:rPr>
+        <w:t>"फटकेगा"</w:t>
+      </w:r>
+    </w:p>
+    <w:p>
+      <w:pPr/>
+      <w:r>
+        <w:rPr>
+          <w:lang w:val="hi_IN" w:bidi="hi_IN"/>
+        </w:rPr>
+      </w:r>
+      <w:r>
+        <w:rPr>
+          <w:b/>
+          <w:lang w:val="hi_IN" w:bidi="hi_IN"/>
+        </w:rPr>
+        <w:t>वह फटक रहा होगा</w:t>
+      </w:r>
+      <w:r>
+        <w:rPr>
+          <w:lang w:val="hi_IN" w:bidi="hi_IN"/>
+        </w:rPr>
+        <w:t xml:space="preserve"> फटकने का अर्थ दाने को भूसे से अलग करना, हवा में दाने और भूसे को उछालने से, हवा के जोर से यह अलग अलग हो जाते हैं।</w:t>
+      </w:r>
+      <w:r>
+        <w:rPr>
+          <w:lang w:val="hi_IN" w:bidi="hi_IN"/>
+        </w:rPr>
+      </w:r>
+      <w:r>
+        <w:rPr>
+          <w:lang w:val="hi_IN" w:bidi="hi_IN"/>
+        </w:rPr>
+      </w:r>
+    </w:p>
+    <w:p>
+      <w:pPr/>
+      <w:r>
+        <w:rPr>
+          <w:lang w:val="hi_IN" w:bidi="hi_IN"/>
+        </w:rPr>
+      </w:r>
+    </w:p>
+    <w:p>
+      <w:pPr>
+        <w:pStyle w:val="Heading2"/>
+      </w:pPr>
+      <w:r>
+        <w:rPr>
+          <w:lang w:val="hi_IN" w:bidi="hi_IN"/>
+        </w:rPr>
         <w:t>रूत 3:3 (#1)</w:t>
       </w:r>
       <w:r>
@@ -18183,6 +19766,153 @@
         <w:rPr>
           <w:lang w:val="hi_IN" w:bidi="hi_IN"/>
         </w:rPr>
+        <w:t>रूत 3:4 (#2)</w:t>
+      </w:r>
+      <w:r>
+        <w:rPr>
+          <w:lang w:val="hi_IN" w:bidi="hi_IN"/>
+        </w:rPr>
+      </w:r>
+    </w:p>
+    <w:p>
+      <w:pPr/>
+      <w:r>
+        <w:rPr>
+          <w:lang w:val="hi_IN" w:bidi="hi_IN"/>
+        </w:rPr>
+      </w:r>
+      <w:r>
+        <w:rPr>
+          <w:b/>
+          <w:lang w:val="hi_IN" w:bidi="hi_IN"/>
+        </w:rPr>
+        <w:t>"लेट"</w:t>
+      </w:r>
+    </w:p>
+    <w:p>
+      <w:pPr/>
+      <w:r>
+        <w:rPr>
+          <w:lang w:val="hi_IN" w:bidi="hi_IN"/>
+        </w:rPr>
+      </w:r>
+      <w:r>
+        <w:rPr>
+          <w:lang w:val="hi_IN" w:bidi="hi_IN"/>
+        </w:rPr>
+        <w:t>यह एक पृष्ठभूमि का खंड है, जिसमें बताया गया है कि रूत को यह ध्यान देना चाहिए कि बोअज कहाँ सो रहा है।</w:t>
+      </w:r>
+    </w:p>
+    <w:p>
+      <w:pPr/>
+      <w:r>
+        <w:rPr>
+          <w:lang w:val="hi_IN" w:bidi="hi_IN"/>
+        </w:rPr>
+      </w:r>
+      <w:r>
+        <w:rPr>
+          <w:lang w:val="hi_IN" w:bidi="hi_IN"/>
+        </w:rPr>
+        <w:t xml:space="preserve">देखें: </w:t>
+      </w:r>
+      <w:r>
+        <w:rPr>
+          <w:lang w:val="hi_IN" w:bidi="hi_IN"/>
+        </w:rPr>
+        <w:t>जोड़ें — पृष्ठभूमि जानकारी</w:t>
+      </w:r>
+      <w:r>
+        <w:rPr>
+          <w:lang w:val="hi_IN" w:bidi="hi_IN"/>
+        </w:rPr>
+      </w:r>
+      <w:r>
+        <w:rPr>
+          <w:lang w:val="hi_IN" w:bidi="hi_IN"/>
+        </w:rPr>
+      </w:r>
+    </w:p>
+    <w:p>
+      <w:pPr/>
+      <w:r>
+        <w:rPr>
+          <w:lang w:val="hi_IN" w:bidi="hi_IN"/>
+        </w:rPr>
+      </w:r>
+    </w:p>
+    <w:p>
+      <w:pPr>
+        <w:pStyle w:val="Heading2"/>
+      </w:pPr>
+      <w:r>
+        <w:rPr>
+          <w:lang w:val="hi_IN" w:bidi="hi_IN"/>
+        </w:rPr>
+        <w:t>रूत 3:4 (#5)</w:t>
+      </w:r>
+      <w:r>
+        <w:rPr>
+          <w:lang w:val="hi_IN" w:bidi="hi_IN"/>
+        </w:rPr>
+      </w:r>
+    </w:p>
+    <w:p>
+      <w:pPr/>
+      <w:r>
+        <w:rPr>
+          <w:lang w:val="hi_IN" w:bidi="hi_IN"/>
+        </w:rPr>
+      </w:r>
+      <w:r>
+        <w:rPr>
+          <w:b/>
+          <w:lang w:val="hi_IN" w:bidi="hi_IN"/>
+        </w:rPr>
+        <w:t>""</w:t>
+      </w:r>
+    </w:p>
+    <w:p>
+      <w:pPr/>
+      <w:r>
+        <w:rPr>
+          <w:lang w:val="hi_IN" w:bidi="hi_IN"/>
+        </w:rPr>
+      </w:r>
+      <w:r>
+        <w:rPr>
+          <w:b/>
+          <w:lang w:val="hi_IN" w:bidi="hi_IN"/>
+        </w:rPr>
+        <w:t>और वहीं लेट जाना</w:t>
+      </w:r>
+      <w:r>
+        <w:rPr>
+          <w:lang w:val="hi_IN" w:bidi="hi_IN"/>
+        </w:rPr>
+      </w:r>
+      <w:r>
+        <w:rPr>
+          <w:lang w:val="hi_IN" w:bidi="hi_IN"/>
+        </w:rPr>
+      </w:r>
+    </w:p>
+    <w:p>
+      <w:pPr/>
+      <w:r>
+        <w:rPr>
+          <w:lang w:val="hi_IN" w:bidi="hi_IN"/>
+        </w:rPr>
+      </w:r>
+    </w:p>
+    <w:p>
+      <w:pPr>
+        <w:pStyle w:val="Heading2"/>
+      </w:pPr>
+      <w:r>
+        <w:rPr>
+          <w:lang w:val="hi_IN" w:bidi="hi_IN"/>
+        </w:rPr>
         <w:t>रूत 3:6 (#1)</w:t>
       </w:r>
       <w:r>
@@ -18579,6 +20309,70 @@
         <w:rPr>
           <w:lang w:val="hi_IN" w:bidi="hi_IN"/>
         </w:rPr>
+        <w:t>रूत 3:7 (#4)</w:t>
+      </w:r>
+      <w:r>
+        <w:rPr>
+          <w:lang w:val="hi_IN" w:bidi="hi_IN"/>
+        </w:rPr>
+      </w:r>
+    </w:p>
+    <w:p>
+      <w:pPr/>
+      <w:r>
+        <w:rPr>
+          <w:lang w:val="hi_IN" w:bidi="hi_IN"/>
+        </w:rPr>
+      </w:r>
+      <w:r>
+        <w:rPr>
+          <w:b/>
+          <w:lang w:val="hi_IN" w:bidi="hi_IN"/>
+        </w:rPr>
+        <w:t>"लेट"</w:t>
+      </w:r>
+    </w:p>
+    <w:p>
+      <w:pPr/>
+      <w:r>
+        <w:rPr>
+          <w:lang w:val="hi_IN" w:bidi="hi_IN"/>
+        </w:rPr>
+      </w:r>
+      <w:r>
+        <w:rPr>
+          <w:b/>
+          <w:lang w:val="hi_IN" w:bidi="hi_IN"/>
+        </w:rPr>
+        <w:t>वहीं लेट गई</w:t>
+      </w:r>
+      <w:r>
+        <w:rPr>
+          <w:lang w:val="hi_IN" w:bidi="hi_IN"/>
+        </w:rPr>
+      </w:r>
+      <w:r>
+        <w:rPr>
+          <w:lang w:val="hi_IN" w:bidi="hi_IN"/>
+        </w:rPr>
+      </w:r>
+    </w:p>
+    <w:p>
+      <w:pPr/>
+      <w:r>
+        <w:rPr>
+          <w:lang w:val="hi_IN" w:bidi="hi_IN"/>
+        </w:rPr>
+      </w:r>
+    </w:p>
+    <w:p>
+      <w:pPr>
+        <w:pStyle w:val="Heading2"/>
+      </w:pPr>
+      <w:r>
+        <w:rPr>
+          <w:lang w:val="hi_IN" w:bidi="hi_IN"/>
+        </w:rPr>
         <w:t>रूत 3:8 (#1)</w:t>
       </w:r>
       <w:r>
@@ -18844,6 +20638,69 @@
         <w:rPr>
           <w:lang w:val="hi_IN" w:bidi="hi_IN"/>
         </w:rPr>
+        <w:t>रूत 3:8 (#4)</w:t>
+      </w:r>
+      <w:r>
+        <w:rPr>
+          <w:lang w:val="hi_IN" w:bidi="hi_IN"/>
+        </w:rPr>
+      </w:r>
+    </w:p>
+    <w:p>
+      <w:pPr/>
+      <w:r>
+        <w:rPr>
+          <w:lang w:val="hi_IN" w:bidi="hi_IN"/>
+        </w:rPr>
+      </w:r>
+      <w:r>
+        <w:rPr>
+          <w:b/>
+          <w:lang w:val="hi_IN" w:bidi="hi_IN"/>
+        </w:rPr>
+        <w:t>"पाँवों स्त्री लेटी है"</w:t>
+      </w:r>
+    </w:p>
+    <w:p>
+      <w:pPr/>
+      <w:r>
+        <w:rPr>
+          <w:lang w:val="hi_IN" w:bidi="hi_IN"/>
+        </w:rPr>
+      </w:r>
+      <w:r>
+        <w:rPr>
+          <w:lang w:val="hi_IN" w:bidi="hi_IN"/>
+        </w:rPr>
+        <w:t>यह महिला रूत थी, लेकिन बोअज उसे अंधेरे में पहचान ना सका।</w:t>
+      </w:r>
+      <w:r>
+        <w:rPr>
+          <w:lang w:val="hi_IN" w:bidi="hi_IN"/>
+        </w:rPr>
+      </w:r>
+      <w:r>
+        <w:rPr>
+          <w:lang w:val="hi_IN" w:bidi="hi_IN"/>
+        </w:rPr>
+      </w:r>
+    </w:p>
+    <w:p>
+      <w:pPr/>
+      <w:r>
+        <w:rPr>
+          <w:lang w:val="hi_IN" w:bidi="hi_IN"/>
+        </w:rPr>
+      </w:r>
+    </w:p>
+    <w:p>
+      <w:pPr>
+        <w:pStyle w:val="Heading2"/>
+      </w:pPr>
+      <w:r>
+        <w:rPr>
+          <w:lang w:val="hi_IN" w:bidi="hi_IN"/>
+        </w:rPr>
         <w:t>रूत 3:9 (#1)</w:t>
       </w:r>
       <w:r>
@@ -19561,6 +21418,82 @@
         <w:rPr>
           <w:lang w:val="hi_IN" w:bidi="hi_IN"/>
         </w:rPr>
+        <w:t>रूत 3:10 (#2)</w:t>
+      </w:r>
+      <w:r>
+        <w:rPr>
+          <w:lang w:val="hi_IN" w:bidi="hi_IN"/>
+        </w:rPr>
+      </w:r>
+    </w:p>
+    <w:p>
+      <w:pPr/>
+      <w:r>
+        <w:rPr>
+          <w:lang w:val="hi_IN" w:bidi="hi_IN"/>
+        </w:rPr>
+      </w:r>
+      <w:r>
+        <w:rPr>
+          <w:b/>
+          <w:lang w:val="hi_IN" w:bidi="hi_IN"/>
+        </w:rPr>
+        <w:t>"पिछली प्रीति"</w:t>
+      </w:r>
+      <w:r>
+        <w:rPr>
+          <w:lang w:val="hi_IN" w:bidi="hi_IN"/>
+        </w:rPr>
+        <w:t xml:space="preserve"> - </w:t>
+      </w:r>
+      <w:r>
+        <w:rPr>
+          <w:b/>
+          <w:lang w:val="hi_IN" w:bidi="hi_IN"/>
+        </w:rPr>
+        <w:t>"अधिक दिखाई"</w:t>
+      </w:r>
+    </w:p>
+    <w:p>
+      <w:pPr/>
+      <w:r>
+        <w:rPr>
+          <w:lang w:val="hi_IN" w:bidi="hi_IN"/>
+        </w:rPr>
+      </w:r>
+      <w:r>
+        <w:rPr>
+          <w:lang w:val="hi_IN" w:bidi="hi_IN"/>
+        </w:rPr>
+        <w:t>यह इस बात को संदर्भित करता है कि रूत, बोअज से विवाह करने के लिए कह रही है। बोअज, रूत की नाओमी और परिवार के प्रति निस्वार्थ प्रीति और निष्ठा को देख रहा था। नाओमी के रिश्तेदार से शादी करके, रूत नाओमी के बेटे का सम्मान करेगी और नाओमी की पारिवारिक वंश को जारी रखेगी।</w:t>
+      </w:r>
+      <w:r>
+        <w:rPr>
+          <w:lang w:val="hi_IN" w:bidi="hi_IN"/>
+        </w:rPr>
+      </w:r>
+      <w:r>
+        <w:rPr>
+          <w:lang w:val="hi_IN" w:bidi="hi_IN"/>
+        </w:rPr>
+      </w:r>
+    </w:p>
+    <w:p>
+      <w:pPr/>
+      <w:r>
+        <w:rPr>
+          <w:lang w:val="hi_IN" w:bidi="hi_IN"/>
+        </w:rPr>
+      </w:r>
+    </w:p>
+    <w:p>
+      <w:pPr>
+        <w:pStyle w:val="Heading2"/>
+      </w:pPr>
+      <w:r>
+        <w:rPr>
+          <w:lang w:val="hi_IN" w:bidi="hi_IN"/>
+        </w:rPr>
         <w:t>रूत 3:11 (#1)</w:t>
       </w:r>
       <w:r>
@@ -23172,6 +25105,70 @@
         <w:rPr>
           <w:lang w:val="hi_IN" w:bidi="hi_IN"/>
         </w:rPr>
+        <w:t>रूत 4:2 (#2)</w:t>
+      </w:r>
+      <w:r>
+        <w:rPr>
+          <w:lang w:val="hi_IN" w:bidi="hi_IN"/>
+        </w:rPr>
+      </w:r>
+    </w:p>
+    <w:p>
+      <w:pPr/>
+      <w:r>
+        <w:rPr>
+          <w:lang w:val="hi_IN" w:bidi="hi_IN"/>
+        </w:rPr>
+      </w:r>
+      <w:r>
+        <w:rPr>
+          <w:b/>
+          <w:lang w:val="hi_IN" w:bidi="hi_IN"/>
+        </w:rPr>
+        <w:t>""नगर"</w:t>
+      </w:r>
+    </w:p>
+    <w:p>
+      <w:pPr/>
+      <w:r>
+        <w:rPr>
+          <w:lang w:val="hi_IN" w:bidi="hi_IN"/>
+        </w:rPr>
+      </w:r>
+      <w:r>
+        <w:rPr>
+          <w:b/>
+          <w:lang w:val="hi_IN" w:bidi="hi_IN"/>
+        </w:rPr>
+        <w:t>नगर के अगुवों में से</w:t>
+      </w:r>
+      <w:r>
+        <w:rPr>
+          <w:lang w:val="hi_IN" w:bidi="hi_IN"/>
+        </w:rPr>
+      </w:r>
+      <w:r>
+        <w:rPr>
+          <w:lang w:val="hi_IN" w:bidi="hi_IN"/>
+        </w:rPr>
+      </w:r>
+    </w:p>
+    <w:p>
+      <w:pPr/>
+      <w:r>
+        <w:rPr>
+          <w:lang w:val="hi_IN" w:bidi="hi_IN"/>
+        </w:rPr>
+      </w:r>
+    </w:p>
+    <w:p>
+      <w:pPr>
+        <w:pStyle w:val="Heading2"/>
+      </w:pPr>
+      <w:r>
+        <w:rPr>
+          <w:lang w:val="hi_IN" w:bidi="hi_IN"/>
+        </w:rPr>
         <w:t>रूत 4:3 (#1)</w:t>
       </w:r>
       <w:r>
@@ -23831,6 +25828,82 @@
         <w:rPr>
           <w:lang w:val="hi_IN" w:bidi="hi_IN"/>
         </w:rPr>
+        <w:t>रूत 4:4 (#5)</w:t>
+      </w:r>
+      <w:r>
+        <w:rPr>
+          <w:lang w:val="hi_IN" w:bidi="hi_IN"/>
+        </w:rPr>
+      </w:r>
+    </w:p>
+    <w:p>
+      <w:pPr/>
+      <w:r>
+        <w:rPr>
+          <w:lang w:val="hi_IN" w:bidi="hi_IN"/>
+        </w:rPr>
+      </w:r>
+      <w:r>
+        <w:rPr>
+          <w:b/>
+          <w:lang w:val="hi_IN" w:bidi="hi_IN"/>
+        </w:rPr>
+        <w:t>""के"</w:t>
+      </w:r>
+      <w:r>
+        <w:rPr>
+          <w:lang w:val="hi_IN" w:bidi="hi_IN"/>
+        </w:rPr>
+        <w:t xml:space="preserve"> - </w:t>
+      </w:r>
+      <w:r>
+        <w:rPr>
+          <w:b/>
+          <w:lang w:val="hi_IN" w:bidi="hi_IN"/>
+        </w:rPr>
+        <w:t>"तेरे"</w:t>
+      </w:r>
+    </w:p>
+    <w:p>
+      <w:pPr/>
+      <w:r>
+        <w:rPr>
+          <w:lang w:val="hi_IN" w:bidi="hi_IN"/>
+        </w:rPr>
+      </w:r>
+      <w:r>
+        <w:rPr>
+          <w:lang w:val="hi_IN" w:bidi="hi_IN"/>
+        </w:rPr>
+        <w:t>बोअज एलीमेलेक का करीबी छुड़ानेवाला परिजन था, और इसलिए भूमि को छुड़ाने का उसके पास दोहरा अधिकार था।</w:t>
+      </w:r>
+      <w:r>
+        <w:rPr>
+          <w:lang w:val="hi_IN" w:bidi="hi_IN"/>
+        </w:rPr>
+      </w:r>
+      <w:r>
+        <w:rPr>
+          <w:lang w:val="hi_IN" w:bidi="hi_IN"/>
+        </w:rPr>
+      </w:r>
+    </w:p>
+    <w:p>
+      <w:pPr/>
+      <w:r>
+        <w:rPr>
+          <w:lang w:val="hi_IN" w:bidi="hi_IN"/>
+        </w:rPr>
+      </w:r>
+    </w:p>
+    <w:p>
+      <w:pPr>
+        <w:pStyle w:val="Heading2"/>
+      </w:pPr>
+      <w:r>
+        <w:rPr>
+          <w:lang w:val="hi_IN" w:bidi="hi_IN"/>
+        </w:rPr>
         <w:t>रूत 4:5 (#1)</w:t>
       </w:r>
       <w:r>
@@ -24383,6 +26456,69 @@
         <w:rPr>
           <w:lang w:val="hi_IN" w:bidi="hi_IN"/>
         </w:rPr>
+        <w:t>रूत 4:5 (#1)</w:t>
+      </w:r>
+      <w:r>
+        <w:rPr>
+          <w:lang w:val="hi_IN" w:bidi="hi_IN"/>
+        </w:rPr>
+      </w:r>
+    </w:p>
+    <w:p>
+      <w:pPr/>
+      <w:r>
+        <w:rPr>
+          <w:lang w:val="hi_IN" w:bidi="hi_IN"/>
+        </w:rPr>
+      </w:r>
+      <w:r>
+        <w:rPr>
+          <w:b/>
+          <w:lang w:val="hi_IN" w:bidi="hi_IN"/>
+        </w:rPr>
+        <w:t>"मोल ले उसे"</w:t>
+      </w:r>
+    </w:p>
+    <w:p>
+      <w:pPr/>
+      <w:r>
+        <w:rPr>
+          <w:lang w:val="hi_IN" w:bidi="hi_IN"/>
+        </w:rPr>
+      </w:r>
+      <w:r>
+        <w:rPr>
+          <w:lang w:val="hi_IN" w:bidi="hi_IN"/>
+        </w:rPr>
+        <w:t>"बोअज इस अभिव्यक्ति का उपयोग अपने रिश्तेदार को बताने के लिए करता है, यदि वह जमीन खरीदता है उसके साथ साथ अतिरिक्त जिम्मेदारी भी है। वैकल्पिक अनुवाद: ""जब तू जमीन खरीदता है, तो यह भी साथ मिलता है है"""</w:t>
+      </w:r>
+      <w:r>
+        <w:rPr>
+          <w:lang w:val="hi_IN" w:bidi="hi_IN"/>
+        </w:rPr>
+      </w:r>
+      <w:r>
+        <w:rPr>
+          <w:lang w:val="hi_IN" w:bidi="hi_IN"/>
+        </w:rPr>
+      </w:r>
+    </w:p>
+    <w:p>
+      <w:pPr/>
+      <w:r>
+        <w:rPr>
+          <w:lang w:val="hi_IN" w:bidi="hi_IN"/>
+        </w:rPr>
+      </w:r>
+    </w:p>
+    <w:p>
+      <w:pPr>
+        <w:pStyle w:val="Heading2"/>
+      </w:pPr>
+      <w:r>
+        <w:rPr>
+          <w:lang w:val="hi_IN" w:bidi="hi_IN"/>
+        </w:rPr>
         <w:t>रूत 4:6 (#1)</w:t>
       </w:r>
       <w:r>
@@ -26948,6 +29084,69 @@
         <w:rPr>
           <w:lang w:val="hi_IN" w:bidi="hi_IN"/>
         </w:rPr>
+        <w:t>रूत 4:11 (#7)</w:t>
+      </w:r>
+      <w:r>
+        <w:rPr>
+          <w:lang w:val="hi_IN" w:bidi="hi_IN"/>
+        </w:rPr>
+      </w:r>
+    </w:p>
+    <w:p>
+      <w:pPr/>
+      <w:r>
+        <w:rPr>
+          <w:lang w:val="hi_IN" w:bidi="hi_IN"/>
+        </w:rPr>
+      </w:r>
+      <w:r>
+        <w:rPr>
+          <w:b/>
+          <w:lang w:val="hi_IN" w:bidi="hi_IN"/>
+        </w:rPr>
+        <w:t>""करे। एप्राता"</w:t>
+      </w:r>
+    </w:p>
+    <w:p>
+      <w:pPr/>
+      <w:r>
+        <w:rPr>
+          <w:lang w:val="hi_IN" w:bidi="hi_IN"/>
+        </w:rPr>
+      </w:r>
+      <w:r>
+        <w:rPr>
+          <w:lang w:val="hi_IN" w:bidi="hi_IN"/>
+        </w:rPr>
+        <w:t>बैतलहम शहर के आस-पास के क्षेत्र को एप्राता के नाम से जाना जाता था, और यह शहर का दूसरा नाम बना। संभवतः यह नाम इस्राएल के कबीले से आया था जो बैतलहम शहर में और उसके आसपास बस गए थे।</w:t>
+      </w:r>
+      <w:r>
+        <w:rPr>
+          <w:lang w:val="hi_IN" w:bidi="hi_IN"/>
+        </w:rPr>
+      </w:r>
+      <w:r>
+        <w:rPr>
+          <w:lang w:val="hi_IN" w:bidi="hi_IN"/>
+        </w:rPr>
+      </w:r>
+    </w:p>
+    <w:p>
+      <w:pPr/>
+      <w:r>
+        <w:rPr>
+          <w:lang w:val="hi_IN" w:bidi="hi_IN"/>
+        </w:rPr>
+      </w:r>
+    </w:p>
+    <w:p>
+      <w:pPr>
+        <w:pStyle w:val="Heading2"/>
+      </w:pPr>
+      <w:r>
+        <w:rPr>
+          <w:lang w:val="hi_IN" w:bidi="hi_IN"/>
+        </w:rPr>
         <w:t>रूत 4:12 (#1)</w:t>
       </w:r>
       <w:r>
@@ -27127,6 +29326,82 @@
           <w:lang w:val="hi_IN" w:bidi="hi_IN"/>
         </w:rPr>
         <w:t>लोग यहोवा से आशीश मांग रहे हैं, कि वह रूत से बोअज को पेरेस के समान कई बच्चे देगा। आशीर्वाद के रूप का उपयोग करें जो आपकी भाषा में उपयुक्त है।</w:t>
+      </w:r>
+      <w:r>
+        <w:rPr>
+          <w:lang w:val="hi_IN" w:bidi="hi_IN"/>
+        </w:rPr>
+      </w:r>
+      <w:r>
+        <w:rPr>
+          <w:lang w:val="hi_IN" w:bidi="hi_IN"/>
+        </w:rPr>
+      </w:r>
+    </w:p>
+    <w:p>
+      <w:pPr/>
+      <w:r>
+        <w:rPr>
+          <w:lang w:val="hi_IN" w:bidi="hi_IN"/>
+        </w:rPr>
+      </w:r>
+    </w:p>
+    <w:p>
+      <w:pPr>
+        <w:pStyle w:val="Heading2"/>
+      </w:pPr>
+      <w:r>
+        <w:rPr>
+          <w:lang w:val="hi_IN" w:bidi="hi_IN"/>
+        </w:rPr>
+        <w:t>रूत 4:12 (#2)</w:t>
+      </w:r>
+      <w:r>
+        <w:rPr>
+          <w:lang w:val="hi_IN" w:bidi="hi_IN"/>
+        </w:rPr>
+      </w:r>
+    </w:p>
+    <w:p>
+      <w:pPr/>
+      <w:r>
+        <w:rPr>
+          <w:lang w:val="hi_IN" w:bidi="hi_IN"/>
+        </w:rPr>
+      </w:r>
+      <w:r>
+        <w:rPr>
+          <w:b/>
+          <w:lang w:val="hi_IN" w:bidi="hi_IN"/>
+        </w:rPr>
+        <w:t>"जवान स्त्री"</w:t>
+      </w:r>
+      <w:r>
+        <w:rPr>
+          <w:lang w:val="hi_IN" w:bidi="hi_IN"/>
+        </w:rPr>
+        <w:t xml:space="preserve"> - </w:t>
+      </w:r>
+      <w:r>
+        <w:rPr>
+          <w:b/>
+          <w:lang w:val="hi_IN" w:bidi="hi_IN"/>
+        </w:rPr>
+        <w:t>"तामार यहूदा"</w:t>
+      </w:r>
+    </w:p>
+    <w:p>
+      <w:pPr/>
+      <w:r>
+        <w:rPr>
+          <w:lang w:val="hi_IN" w:bidi="hi_IN"/>
+        </w:rPr>
+      </w:r>
+      <w:r>
+        <w:rPr>
+          <w:lang w:val="hi_IN" w:bidi="hi_IN"/>
+        </w:rPr>
+        <w:t>रूत की तरह तामार भी एक विधवा थी। यहूदा से तामार ने एक पुत्र को जन्म दिया, जिसने अपने मृतक पति का पारिवारिक नाम जारी रखा।</w:t>
       </w:r>
       <w:r>
         <w:rPr>

</xml_diff>